<commit_message>
Melee and shot finish
sem o sistema de infligir dano
</commit_message>
<xml_diff>
--- a/Fire Force.pdf.docx
+++ b/Fire Force.pdf.docx
@@ -22,8 +22,16 @@
         <w:rPr>
           <w:color w:val="EE0000"/>
         </w:rPr>
-        <w:t xml:space="preserve"> Force</w:t>
-      </w:r>
+        <w:t xml:space="preserve"> </w:t>
+      </w:r>
+      <w:proofErr w:type="spellStart"/>
+      <w:r>
+        <w:rPr>
+          <w:color w:val="EE0000"/>
+        </w:rPr>
+        <w:t>Source</w:t>
+      </w:r>
+      <w:proofErr w:type="spellEnd"/>
     </w:p>
     <w:p>
       <w:pPr>
@@ -103,10 +111,7 @@
         </w:numPr>
       </w:pPr>
       <w:r>
-        <w:t>Carvão – 70%</w:t>
-      </w:r>
-      <w:r>
-        <w:t xml:space="preserve"> vida</w:t>
+        <w:t>Carvão – 70% vida</w:t>
       </w:r>
     </w:p>
     <w:p>
@@ -118,10 +123,7 @@
         </w:numPr>
       </w:pPr>
       <w:r>
-        <w:t>Tronco – 50%</w:t>
-      </w:r>
-      <w:r>
-        <w:t xml:space="preserve"> vida</w:t>
+        <w:t>Tronco – 50% vida</w:t>
       </w:r>
     </w:p>
     <w:p>
@@ -133,10 +135,7 @@
         </w:numPr>
       </w:pPr>
       <w:r>
-        <w:t>Folha – 30%</w:t>
-      </w:r>
-      <w:r>
-        <w:t xml:space="preserve"> vida </w:t>
+        <w:t xml:space="preserve">Folha – 30% vida </w:t>
       </w:r>
     </w:p>
     <w:p>
@@ -170,6 +169,63 @@
         </w:numPr>
       </w:pPr>
       <w:r>
+        <w:drawing>
+          <wp:anchor distT="0" distB="0" distL="114300" distR="114300" simplePos="0" relativeHeight="251659264" behindDoc="0" locked="0" layoutInCell="1" allowOverlap="1" wp14:anchorId="43CF998F" wp14:editId="3C6F10AF">
+            <wp:simplePos x="0" y="0"/>
+            <wp:positionH relativeFrom="column">
+              <wp:posOffset>1205865</wp:posOffset>
+            </wp:positionH>
+            <wp:positionV relativeFrom="paragraph">
+              <wp:posOffset>226695</wp:posOffset>
+            </wp:positionV>
+            <wp:extent cx="2259330" cy="1609725"/>
+            <wp:effectExtent l="0" t="0" r="7620" b="9525"/>
+            <wp:wrapTopAndBottom/>
+            <wp:docPr id="1697363393" name="Imagem 1"/>
+            <wp:cNvGraphicFramePr>
+              <a:graphicFrameLocks xmlns:a="http://schemas.openxmlformats.org/drawingml/2006/main" noChangeAspect="1"/>
+            </wp:cNvGraphicFramePr>
+            <a:graphic xmlns:a="http://schemas.openxmlformats.org/drawingml/2006/main">
+              <a:graphicData uri="http://schemas.openxmlformats.org/drawingml/2006/picture">
+                <pic:pic xmlns:pic="http://schemas.openxmlformats.org/drawingml/2006/picture">
+                  <pic:nvPicPr>
+                    <pic:cNvPr id="1697363393" name=""/>
+                    <pic:cNvPicPr/>
+                  </pic:nvPicPr>
+                  <pic:blipFill>
+                    <a:blip r:embed="rId5" cstate="print">
+                      <a:extLst>
+                        <a:ext uri="{28A0092B-C50C-407E-A947-70E740481C1C}">
+                          <a14:useLocalDpi xmlns:a14="http://schemas.microsoft.com/office/drawing/2010/main" val="0"/>
+                        </a:ext>
+                      </a:extLst>
+                    </a:blip>
+                    <a:stretch>
+                      <a:fillRect/>
+                    </a:stretch>
+                  </pic:blipFill>
+                  <pic:spPr>
+                    <a:xfrm>
+                      <a:off x="0" y="0"/>
+                      <a:ext cx="2259330" cy="1609725"/>
+                    </a:xfrm>
+                    <a:prstGeom prst="rect">
+                      <a:avLst/>
+                    </a:prstGeom>
+                  </pic:spPr>
+                </pic:pic>
+              </a:graphicData>
+            </a:graphic>
+            <wp14:sizeRelH relativeFrom="margin">
+              <wp14:pctWidth>0</wp14:pctWidth>
+            </wp14:sizeRelH>
+            <wp14:sizeRelV relativeFrom="margin">
+              <wp14:pctHeight>0</wp14:pctHeight>
+            </wp14:sizeRelV>
+          </wp:anchor>
+        </w:drawing>
+      </w:r>
+      <w:r>
         <w:t xml:space="preserve">Fogos Circulares a volta do </w:t>
       </w:r>
       <w:proofErr w:type="spellStart"/>
@@ -187,6 +243,60 @@
         </w:numPr>
       </w:pPr>
       <w:r>
+        <w:rPr>
+          <w:noProof/>
+        </w:rPr>
+        <w:drawing>
+          <wp:anchor distT="0" distB="0" distL="114300" distR="114300" simplePos="0" relativeHeight="251660288" behindDoc="0" locked="0" layoutInCell="1" allowOverlap="1" wp14:anchorId="7D642B73" wp14:editId="7EAC33C7">
+            <wp:simplePos x="0" y="0"/>
+            <wp:positionH relativeFrom="column">
+              <wp:posOffset>1196340</wp:posOffset>
+            </wp:positionH>
+            <wp:positionV relativeFrom="paragraph">
+              <wp:posOffset>1859915</wp:posOffset>
+            </wp:positionV>
+            <wp:extent cx="2361565" cy="1688974"/>
+            <wp:effectExtent l="0" t="0" r="635" b="6985"/>
+            <wp:wrapTopAndBottom/>
+            <wp:docPr id="239797793" name="Imagem 1"/>
+            <wp:cNvGraphicFramePr>
+              <a:graphicFrameLocks xmlns:a="http://schemas.openxmlformats.org/drawingml/2006/main" noChangeAspect="1"/>
+            </wp:cNvGraphicFramePr>
+            <a:graphic xmlns:a="http://schemas.openxmlformats.org/drawingml/2006/main">
+              <a:graphicData uri="http://schemas.openxmlformats.org/drawingml/2006/picture">
+                <pic:pic xmlns:pic="http://schemas.openxmlformats.org/drawingml/2006/picture">
+                  <pic:nvPicPr>
+                    <pic:cNvPr id="239797793" name=""/>
+                    <pic:cNvPicPr/>
+                  </pic:nvPicPr>
+                  <pic:blipFill>
+                    <a:blip r:embed="rId6" cstate="print">
+                      <a:extLst>
+                        <a:ext uri="{28A0092B-C50C-407E-A947-70E740481C1C}">
+                          <a14:useLocalDpi xmlns:a14="http://schemas.microsoft.com/office/drawing/2010/main" val="0"/>
+                        </a:ext>
+                      </a:extLst>
+                    </a:blip>
+                    <a:stretch>
+                      <a:fillRect/>
+                    </a:stretch>
+                  </pic:blipFill>
+                  <pic:spPr>
+                    <a:xfrm>
+                      <a:off x="0" y="0"/>
+                      <a:ext cx="2361565" cy="1688974"/>
+                    </a:xfrm>
+                    <a:prstGeom prst="rect">
+                      <a:avLst/>
+                    </a:prstGeom>
+                  </pic:spPr>
+                </pic:pic>
+              </a:graphicData>
+            </a:graphic>
+          </wp:anchor>
+        </w:drawing>
+      </w:r>
+      <w:r>
         <w:t xml:space="preserve">Pequenas Explosões </w:t>
       </w:r>
     </w:p>
@@ -199,7 +309,109 @@
         </w:numPr>
       </w:pPr>
       <w:r>
-        <w:t>Tiros Ricocheteiam entre inimigos</w:t>
+        <w:t xml:space="preserve">Tiros </w:t>
+      </w:r>
+      <w:r>
+        <w:t>De Fogo</w:t>
+      </w:r>
+    </w:p>
+    <w:p>
+      <w:pPr>
+        <w:pStyle w:val="PargrafodaLista"/>
+        <w:numPr>
+          <w:ilvl w:val="2"/>
+          <w:numId w:val="1"/>
+        </w:numPr>
+      </w:pPr>
+      <w:r>
+        <w:drawing>
+          <wp:anchor distT="0" distB="0" distL="114300" distR="114300" simplePos="0" relativeHeight="251661312" behindDoc="0" locked="0" layoutInCell="1" allowOverlap="1" wp14:anchorId="56763F12" wp14:editId="1704741D">
+            <wp:simplePos x="0" y="0"/>
+            <wp:positionH relativeFrom="column">
+              <wp:posOffset>1165860</wp:posOffset>
+            </wp:positionH>
+            <wp:positionV relativeFrom="paragraph">
+              <wp:posOffset>210185</wp:posOffset>
+            </wp:positionV>
+            <wp:extent cx="2237740" cy="1595120"/>
+            <wp:effectExtent l="0" t="0" r="0" b="5080"/>
+            <wp:wrapTopAndBottom/>
+            <wp:docPr id="1640514404" name="Imagem 1"/>
+            <wp:cNvGraphicFramePr>
+              <a:graphicFrameLocks xmlns:a="http://schemas.openxmlformats.org/drawingml/2006/main" noChangeAspect="1"/>
+            </wp:cNvGraphicFramePr>
+            <a:graphic xmlns:a="http://schemas.openxmlformats.org/drawingml/2006/main">
+              <a:graphicData uri="http://schemas.openxmlformats.org/drawingml/2006/picture">
+                <pic:pic xmlns:pic="http://schemas.openxmlformats.org/drawingml/2006/picture">
+                  <pic:nvPicPr>
+                    <pic:cNvPr id="1640514404" name=""/>
+                    <pic:cNvPicPr/>
+                  </pic:nvPicPr>
+                  <pic:blipFill>
+                    <a:blip r:embed="rId7" cstate="print">
+                      <a:extLst>
+                        <a:ext uri="{28A0092B-C50C-407E-A947-70E740481C1C}">
+                          <a14:useLocalDpi xmlns:a14="http://schemas.microsoft.com/office/drawing/2010/main" val="0"/>
+                        </a:ext>
+                      </a:extLst>
+                    </a:blip>
+                    <a:stretch>
+                      <a:fillRect/>
+                    </a:stretch>
+                  </pic:blipFill>
+                  <pic:spPr>
+                    <a:xfrm>
+                      <a:off x="0" y="0"/>
+                      <a:ext cx="2237740" cy="1595120"/>
+                    </a:xfrm>
+                    <a:prstGeom prst="rect">
+                      <a:avLst/>
+                    </a:prstGeom>
+                  </pic:spPr>
+                </pic:pic>
+              </a:graphicData>
+            </a:graphic>
+            <wp14:sizeRelH relativeFrom="margin">
+              <wp14:pctWidth>0</wp14:pctWidth>
+            </wp14:sizeRelH>
+            <wp14:sizeRelV relativeFrom="margin">
+              <wp14:pctHeight>0</wp14:pctHeight>
+            </wp14:sizeRelV>
+          </wp:anchor>
+        </w:drawing>
+      </w:r>
+      <w:r>
+        <w:t>Lança Chamas</w:t>
+      </w:r>
+    </w:p>
+    <w:p>
+      <w:pPr>
+        <w:pStyle w:val="PargrafodaLista"/>
+        <w:numPr>
+          <w:ilvl w:val="2"/>
+          <w:numId w:val="1"/>
+        </w:numPr>
+      </w:pPr>
+      <w:r>
+        <w:t>Ataque de perto</w:t>
+      </w:r>
+    </w:p>
+    <w:p>
+      <w:pPr>
+        <w:pStyle w:val="PargrafodaLista"/>
+        <w:numPr>
+          <w:ilvl w:val="2"/>
+          <w:numId w:val="1"/>
+        </w:numPr>
+      </w:pPr>
+      <w:proofErr w:type="spellStart"/>
+      <w:r>
+        <w:lastRenderedPageBreak/>
+        <w:t>Area</w:t>
+      </w:r>
+      <w:proofErr w:type="spellEnd"/>
+      <w:r>
+        <w:t xml:space="preserve"> de recuperação de vida – Quando mata um inimigo numa área perto recupera vida</w:t>
       </w:r>
     </w:p>
     <w:p>
@@ -210,6 +422,30 @@
           <w:numId w:val="1"/>
         </w:numPr>
       </w:pPr>
+      <w:r>
+        <w:t>Cada Carta Vai ate ao nível 5</w:t>
+      </w:r>
+    </w:p>
+    <w:p>
+      <w:pPr>
+        <w:pStyle w:val="PargrafodaLista"/>
+        <w:numPr>
+          <w:ilvl w:val="0"/>
+          <w:numId w:val="1"/>
+        </w:numPr>
+      </w:pPr>
+      <w:r>
+        <w:t xml:space="preserve">Assim que escolher 3 Poderes diferentes só pode aparecer nos baús poderes já escolhidos </w:t>
+      </w:r>
+    </w:p>
+    <w:p>
+      <w:pPr>
+        <w:pStyle w:val="PargrafodaLista"/>
+        <w:numPr>
+          <w:ilvl w:val="0"/>
+          <w:numId w:val="1"/>
+        </w:numPr>
+      </w:pPr>
       <w:proofErr w:type="spellStart"/>
       <w:r>
         <w:t>Power</w:t>
@@ -224,7 +460,18 @@
       </w:r>
       <w:proofErr w:type="spellEnd"/>
       <w:r>
-        <w:t xml:space="preserve"> – Dano ou Vida</w:t>
+        <w:t xml:space="preserve"> </w:t>
+      </w:r>
+      <w:r>
+        <w:t xml:space="preserve">de </w:t>
+      </w:r>
+      <w:proofErr w:type="spellStart"/>
+      <w:r>
+        <w:t>stats</w:t>
+      </w:r>
+      <w:proofErr w:type="spellEnd"/>
+      <w:r>
+        <w:t>– Dano ou Vida</w:t>
       </w:r>
     </w:p>
     <w:p>
@@ -271,13 +518,161 @@
           <w:noProof/>
         </w:rPr>
         <w:drawing>
-          <wp:anchor distT="0" distB="0" distL="114300" distR="114300" simplePos="0" relativeHeight="251658240" behindDoc="1" locked="0" layoutInCell="1" allowOverlap="1" wp14:anchorId="4528D626" wp14:editId="0A2FF471">
+          <wp:inline distT="0" distB="0" distL="0" distR="0" wp14:anchorId="711C1E5B" wp14:editId="2214F37F">
+            <wp:extent cx="1835150" cy="2485390"/>
+            <wp:effectExtent l="0" t="0" r="0" b="0"/>
+            <wp:docPr id="1936566268" name="Imagem 1" descr="Coluna com fogo | Vetor Premium"/>
+            <wp:cNvGraphicFramePr>
+              <a:graphicFrameLocks xmlns:a="http://schemas.openxmlformats.org/drawingml/2006/main" noChangeAspect="1"/>
+            </wp:cNvGraphicFramePr>
+            <a:graphic xmlns:a="http://schemas.openxmlformats.org/drawingml/2006/main">
+              <a:graphicData uri="http://schemas.openxmlformats.org/drawingml/2006/picture">
+                <pic:pic xmlns:pic="http://schemas.openxmlformats.org/drawingml/2006/picture">
+                  <pic:nvPicPr>
+                    <pic:cNvPr id="0" name="Picture 1" descr="Coluna com fogo | Vetor Premium"/>
+                    <pic:cNvPicPr>
+                      <a:picLocks noChangeAspect="1" noChangeArrowheads="1"/>
+                    </pic:cNvPicPr>
+                  </pic:nvPicPr>
+                  <pic:blipFill>
+                    <a:blip r:embed="rId8">
+                      <a:extLst>
+                        <a:ext uri="{28A0092B-C50C-407E-A947-70E740481C1C}">
+                          <a14:useLocalDpi xmlns:a14="http://schemas.microsoft.com/office/drawing/2010/main" val="0"/>
+                        </a:ext>
+                      </a:extLst>
+                    </a:blip>
+                    <a:srcRect/>
+                    <a:stretch>
+                      <a:fillRect/>
+                    </a:stretch>
+                  </pic:blipFill>
+                  <pic:spPr bwMode="auto">
+                    <a:xfrm>
+                      <a:off x="0" y="0"/>
+                      <a:ext cx="1835150" cy="2485390"/>
+                    </a:xfrm>
+                    <a:prstGeom prst="rect">
+                      <a:avLst/>
+                    </a:prstGeom>
+                    <a:noFill/>
+                    <a:ln>
+                      <a:noFill/>
+                    </a:ln>
+                  </pic:spPr>
+                </pic:pic>
+              </a:graphicData>
+            </a:graphic>
+          </wp:inline>
+        </w:drawing>
+      </w:r>
+    </w:p>
+    <w:p>
+      <w:pPr>
+        <w:pStyle w:val="PargrafodaLista"/>
+        <w:numPr>
+          <w:ilvl w:val="0"/>
+          <w:numId w:val="6"/>
+        </w:numPr>
+      </w:pPr>
+      <w:r>
+        <w:t>Só passas para a próxima Sala se derrotares</w:t>
+      </w:r>
+      <w:r>
+        <w:t xml:space="preserve"> uma </w:t>
+      </w:r>
+      <w:proofErr w:type="spellStart"/>
+      <w:r>
+        <w:t>Wave</w:t>
+      </w:r>
+      <w:proofErr w:type="spellEnd"/>
+    </w:p>
+    <w:p>
+      <w:pPr>
+        <w:pStyle w:val="PargrafodaLista"/>
+        <w:numPr>
+          <w:ilvl w:val="0"/>
+          <w:numId w:val="6"/>
+        </w:numPr>
+      </w:pPr>
+      <w:r>
+        <w:t xml:space="preserve">Em Cada corredor irá ter um </w:t>
+      </w:r>
+      <w:proofErr w:type="spellStart"/>
+      <w:r>
+        <w:t>bau</w:t>
+      </w:r>
+      <w:proofErr w:type="spellEnd"/>
+    </w:p>
+    <w:p>
+      <w:pPr>
+        <w:pStyle w:val="PargrafodaLista"/>
+        <w:numPr>
+          <w:ilvl w:val="0"/>
+          <w:numId w:val="6"/>
+        </w:numPr>
+      </w:pPr>
+      <w:r>
+        <w:t xml:space="preserve">Para Cada 5 </w:t>
+      </w:r>
+      <w:proofErr w:type="spellStart"/>
+      <w:r>
+        <w:t>Waves</w:t>
+      </w:r>
+      <w:proofErr w:type="spellEnd"/>
+      <w:r>
+        <w:t xml:space="preserve"> haverá uma </w:t>
+      </w:r>
+      <w:proofErr w:type="spellStart"/>
+      <w:r>
+        <w:t>statua</w:t>
+      </w:r>
+      <w:proofErr w:type="spellEnd"/>
+      <w:r>
+        <w:t xml:space="preserve"> para </w:t>
+      </w:r>
+      <w:proofErr w:type="spellStart"/>
+      <w:r>
+        <w:t>Power</w:t>
+      </w:r>
+      <w:proofErr w:type="spellEnd"/>
+      <w:r>
+        <w:t xml:space="preserve"> </w:t>
+      </w:r>
+      <w:proofErr w:type="spellStart"/>
+      <w:r>
+        <w:t>up</w:t>
+      </w:r>
+      <w:proofErr w:type="spellEnd"/>
+      <w:r>
+        <w:t xml:space="preserve"> de </w:t>
+      </w:r>
+      <w:proofErr w:type="spellStart"/>
+      <w:r>
+        <w:t>stats</w:t>
+      </w:r>
+      <w:proofErr w:type="spellEnd"/>
+    </w:p>
+    <w:p>
+      <w:pPr>
+        <w:pStyle w:val="PargrafodaLista"/>
+        <w:numPr>
+          <w:ilvl w:val="0"/>
+          <w:numId w:val="6"/>
+        </w:numPr>
+      </w:pPr>
+      <w:r>
+        <w:rPr>
+          <w:noProof/>
+        </w:rPr>
+        <w:drawing>
+          <wp:anchor distT="0" distB="0" distL="114300" distR="114300" simplePos="0" relativeHeight="251658240" behindDoc="1" locked="0" layoutInCell="1" allowOverlap="1" wp14:anchorId="4528D626" wp14:editId="2D00FAAD">
             <wp:simplePos x="0" y="0"/>
             <wp:positionH relativeFrom="column">
-              <wp:posOffset>4534473</wp:posOffset>
+              <wp:posOffset>352425</wp:posOffset>
             </wp:positionH>
             <wp:positionV relativeFrom="paragraph">
-              <wp:posOffset>2031929</wp:posOffset>
+              <wp:posOffset>131445</wp:posOffset>
             </wp:positionV>
             <wp:extent cx="1474470" cy="3164840"/>
             <wp:effectExtent l="0" t="0" r="0" b="0"/>
@@ -296,7 +691,7 @@
                     </pic:cNvPicPr>
                   </pic:nvPicPr>
                   <pic:blipFill>
-                    <a:blip r:embed="rId5" cstate="print">
+                    <a:blip r:embed="rId9" cstate="print">
                       <a:extLst>
                         <a:ext uri="{28A0092B-C50C-407E-A947-70E740481C1C}">
                           <a14:useLocalDpi xmlns:a14="http://schemas.microsoft.com/office/drawing/2010/main" val="0"/>
@@ -327,142 +722,6 @@
           </wp:anchor>
         </w:drawing>
       </w:r>
-      <w:r>
-        <w:rPr>
-          <w:noProof/>
-        </w:rPr>
-        <w:drawing>
-          <wp:inline distT="0" distB="0" distL="0" distR="0" wp14:anchorId="711C1E5B" wp14:editId="14256468">
-            <wp:extent cx="1835150" cy="2485390"/>
-            <wp:effectExtent l="0" t="0" r="0" b="0"/>
-            <wp:docPr id="1936566268" name="Imagem 1" descr="Coluna com fogo | Vetor Premium"/>
-            <wp:cNvGraphicFramePr>
-              <a:graphicFrameLocks xmlns:a="http://schemas.openxmlformats.org/drawingml/2006/main" noChangeAspect="1"/>
-            </wp:cNvGraphicFramePr>
-            <a:graphic xmlns:a="http://schemas.openxmlformats.org/drawingml/2006/main">
-              <a:graphicData uri="http://schemas.openxmlformats.org/drawingml/2006/picture">
-                <pic:pic xmlns:pic="http://schemas.openxmlformats.org/drawingml/2006/picture">
-                  <pic:nvPicPr>
-                    <pic:cNvPr id="0" name="Picture 1" descr="Coluna com fogo | Vetor Premium"/>
-                    <pic:cNvPicPr>
-                      <a:picLocks noChangeAspect="1" noChangeArrowheads="1"/>
-                    </pic:cNvPicPr>
-                  </pic:nvPicPr>
-                  <pic:blipFill>
-                    <a:blip r:embed="rId6">
-                      <a:extLst>
-                        <a:ext uri="{28A0092B-C50C-407E-A947-70E740481C1C}">
-                          <a14:useLocalDpi xmlns:a14="http://schemas.microsoft.com/office/drawing/2010/main" val="0"/>
-                        </a:ext>
-                      </a:extLst>
-                    </a:blip>
-                    <a:srcRect/>
-                    <a:stretch>
-                      <a:fillRect/>
-                    </a:stretch>
-                  </pic:blipFill>
-                  <pic:spPr bwMode="auto">
-                    <a:xfrm>
-                      <a:off x="0" y="0"/>
-                      <a:ext cx="1835150" cy="2485390"/>
-                    </a:xfrm>
-                    <a:prstGeom prst="rect">
-                      <a:avLst/>
-                    </a:prstGeom>
-                    <a:noFill/>
-                    <a:ln>
-                      <a:noFill/>
-                    </a:ln>
-                  </pic:spPr>
-                </pic:pic>
-              </a:graphicData>
-            </a:graphic>
-          </wp:inline>
-        </w:drawing>
-      </w:r>
-    </w:p>
-    <w:p>
-      <w:pPr>
-        <w:pStyle w:val="PargrafodaLista"/>
-        <w:numPr>
-          <w:ilvl w:val="0"/>
-          <w:numId w:val="6"/>
-        </w:numPr>
-      </w:pPr>
-      <w:r>
-        <w:t>Só passas para a próxima Sala se derrotares</w:t>
-      </w:r>
-      <w:r>
-        <w:t xml:space="preserve"> uma </w:t>
-      </w:r>
-      <w:proofErr w:type="spellStart"/>
-      <w:r>
-        <w:t>Wave</w:t>
-      </w:r>
-      <w:proofErr w:type="spellEnd"/>
-    </w:p>
-    <w:p>
-      <w:pPr>
-        <w:pStyle w:val="PargrafodaLista"/>
-        <w:numPr>
-          <w:ilvl w:val="0"/>
-          <w:numId w:val="6"/>
-        </w:numPr>
-      </w:pPr>
-      <w:r>
-        <w:t xml:space="preserve">Em Cada corredor irá ter um </w:t>
-      </w:r>
-      <w:proofErr w:type="spellStart"/>
-      <w:r>
-        <w:t>bau</w:t>
-      </w:r>
-      <w:proofErr w:type="spellEnd"/>
-    </w:p>
-    <w:p>
-      <w:pPr>
-        <w:pStyle w:val="PargrafodaLista"/>
-        <w:numPr>
-          <w:ilvl w:val="0"/>
-          <w:numId w:val="6"/>
-        </w:numPr>
-      </w:pPr>
-      <w:r>
-        <w:t xml:space="preserve">Para Cada 5 </w:t>
-      </w:r>
-      <w:proofErr w:type="spellStart"/>
-      <w:r>
-        <w:t>Waves</w:t>
-      </w:r>
-      <w:proofErr w:type="spellEnd"/>
-      <w:r>
-        <w:t xml:space="preserve"> haverá uma </w:t>
-      </w:r>
-      <w:proofErr w:type="spellStart"/>
-      <w:r>
-        <w:t>statua</w:t>
-      </w:r>
-      <w:proofErr w:type="spellEnd"/>
-      <w:r>
-        <w:t xml:space="preserve"> para </w:t>
-      </w:r>
-      <w:proofErr w:type="spellStart"/>
-      <w:r>
-        <w:t>Power</w:t>
-      </w:r>
-      <w:proofErr w:type="spellEnd"/>
-      <w:r>
-        <w:t xml:space="preserve"> </w:t>
-      </w:r>
-      <w:proofErr w:type="spellStart"/>
-      <w:r>
-        <w:t>up</w:t>
-      </w:r>
-      <w:proofErr w:type="spellEnd"/>
-    </w:p>
-    <w:p>
-      <w:pPr>
-        <w:pStyle w:val="PargrafodaLista"/>
-      </w:pPr>
     </w:p>
     <w:sectPr>
       <w:pgSz w:w="11906" w:h="16838"/>

</xml_diff>